<commit_message>
Topology diagram: label boards with message IDs only
Replace "node 0xNN" on every board with its heartbeat message ID
(HB 0x7NN), so every number on the diagram is an ID you see on the
bus. Add a legend line explaining HB = 0x700 + node ID. Widen node
boxes so the GPS label fits.

Rename topology_v0.3.png -> topology_v0.4.png, update README links,
and swap the embedded diagram in CAN_Node_Spec_v0.4.docx.
</commit_message>
<xml_diff>
--- a/docs/CAN_Node_Spec_v0.4.docx
+++ b/docs/CAN_Node_Spec_v0.4.docx
@@ -455,7 +455,7 @@
       <w:r>
         <w:drawing>
           <wp:inline distT="0" distB="0" distL="0" distR="0">
-            <wp:extent cx="3714750" cy="3990975"/>
+            <wp:extent cx="3714750" cy="3709155"/>
             <wp:effectExtent t="0" r="0" b="0" l="0"/>
             <wp:docPr id="1" name="" descr="" title=""/>
             <wp:cNvGraphicFramePr>
@@ -480,7 +480,7 @@
                   <pic:spPr bwMode="auto">
                     <a:xfrm>
                       <a:off x="0" y="0"/>
-                      <a:ext cx="3714750" cy="3990975"/>
+                      <a:ext cx="3714750" cy="3709155"/>
                     </a:xfrm>
                     <a:prstGeom prst="rect">
                       <a:avLst/>

</xml_diff>

<commit_message>
Node ID = heartbeat ID everywhere
Follows the Nodes table change (node IDs written as the heartbeat ID,
powertrain 0x706 not 0x06) through the rest of the repo:

- registry: node_id column 0x0N -> 0x70N (checked against heartbeat_id)
- DBC: node comments "Node ID 0x706: ..." (checked against each HB_ ID)
- README, can_id_plan.md: heartbeat rule and ID map say heartbeat ID =
  node ID instead of 0x700 + node ID; v0.4 notes explain the numbering
  and that older notes use the old style
- CAN_Node_Spec_v0.4.docx: node table, heartbeat heading, ID map row,
  v0.4 notes, embedded diagram
- Topology legend, check_dbc.py error text

check_dbc.py: PASS.
</commit_message>
<xml_diff>
--- a/docs/CAN_Node_Spec_v0.4.docx
+++ b/docs/CAN_Node_Spec_v0.4.docx
@@ -72,7 +72,35 @@
           <w:sz w:val="20"/>
           <w:szCs w:val="20"/>
         </w:rPr>
-        <w:t>byte 0 (node ID) removed. The heartbeat ID is already 0x700 + node ID, so the byte repeated it. Every field moves down one byte and the heartbeat is now 7 bytes: state, error flags, firmware major/minor, uptime. Hub and node firmware must update together.</w:t>
+        <w:t>byte 0 (node ID) removed. The heartbeat ID already identifies the node, so the byte repeated it. Every field moves down one byte and the heartbeat is now 7 bytes: state, error flags, firmware major/minor, uptime. Hub and node firmware must update together.</w:t>
+      </w:r>
+    </w:p>
+    <w:p>
+      <w:pPr>
+        <w:pStyle w:val="ListParagraph"/>
+        <w:numPr>
+          <w:ilvl w:val="0"/>
+          <w:numId w:val="2"/>
+        </w:numPr>
+        <w:spacing w:after="60"/>
+      </w:pPr>
+      <w:r>
+        <w:rPr>
+          <w:rFonts w:ascii="Arial" w:cs="Arial" w:eastAsia="Arial" w:hAnsi="Arial"/>
+          <w:b/>
+          <w:bCs/>
+          <w:sz w:val="20"/>
+          <w:szCs w:val="20"/>
+        </w:rPr>
+        <w:t xml:space="preserve">Node IDs: </w:t>
+      </w:r>
+      <w:r>
+        <w:rPr>
+          <w:rFonts w:ascii="Arial" w:cs="Arial" w:eastAsia="Arial" w:hAnsi="Arial"/>
+          <w:sz w:val="20"/>
+          <w:szCs w:val="20"/>
+        </w:rPr>
+        <w:t>now written as the heartbeat ID (powertrain is 0x706, not 0x06). Same boards and heartbeat IDs; only the numbering changed. The v0.3 and v0.2 notes below use the old style (old 0xNN = new 0x7NN).</w:t>
       </w:r>
     </w:p>
     <w:p>
@@ -100,7 +128,7 @@
           <w:sz w:val="20"/>
           <w:szCs w:val="20"/>
         </w:rPr>
-        <w:t>every ID, node ID and data message. Bus load stays at 17.7%.</w:t>
+        <w:t>every message ID and data message. Bus load stays at 17.7%.</w:t>
       </w:r>
     </w:p>
     <w:p>
@@ -1281,7 +1309,7 @@
           <w:sz w:val="22"/>
           <w:szCs w:val="22"/>
         </w:rPr>
-        <w:t xml:space="preserve">Heartbeat: once per second on 0x700 + node ID (no header)</w:t>
+        <w:t>Heartbeat: once per second on the node ID (no header)</w:t>
       </w:r>
     </w:p>
     <w:tbl>
@@ -3310,7 +3338,7 @@
                 <w:sz w:val="17"/>
                 <w:szCs w:val="17"/>
               </w:rPr>
-              <w:t xml:space="preserve">Heartbeats (0x700 + node ID)</w:t>
+              <w:t>Heartbeats (one per node; heartbeat ID = node ID)</w:t>
             </w:r>
           </w:p>
         </w:tc>
@@ -3506,7 +3534,7 @@
                 <w:sz w:val="17"/>
                 <w:szCs w:val="17"/>
               </w:rPr>
-              <w:t xml:space="preserve">0x01</w:t>
+              <w:t>0x701</w:t>
             </w:r>
           </w:p>
         </w:tc>
@@ -3628,7 +3656,7 @@
                 <w:sz w:val="17"/>
                 <w:szCs w:val="17"/>
               </w:rPr>
-              <w:t xml:space="preserve">0x02</w:t>
+              <w:t>0x702</w:t>
             </w:r>
           </w:p>
         </w:tc>
@@ -3750,7 +3778,7 @@
                 <w:sz w:val="17"/>
                 <w:szCs w:val="17"/>
               </w:rPr>
-              <w:t xml:space="preserve">0x03</w:t>
+              <w:t>0x703</w:t>
             </w:r>
           </w:p>
         </w:tc>
@@ -3872,7 +3900,7 @@
                 <w:sz w:val="17"/>
                 <w:szCs w:val="17"/>
               </w:rPr>
-              <w:t xml:space="preserve">0x04</w:t>
+              <w:t>0x704</w:t>
             </w:r>
           </w:p>
         </w:tc>
@@ -3994,7 +4022,7 @@
                 <w:sz w:val="17"/>
                 <w:szCs w:val="17"/>
               </w:rPr>
-              <w:t xml:space="preserve">0x05</w:t>
+              <w:t>0x705</w:t>
             </w:r>
           </w:p>
         </w:tc>
@@ -4116,7 +4144,7 @@
                 <w:sz w:val="17"/>
                 <w:szCs w:val="17"/>
               </w:rPr>
-              <w:t xml:space="preserve">0x06</w:t>
+              <w:t>0x706</w:t>
             </w:r>
           </w:p>
         </w:tc>
@@ -4238,7 +4266,7 @@
                 <w:sz w:val="17"/>
                 <w:szCs w:val="17"/>
               </w:rPr>
-              <w:t xml:space="preserve">0x07</w:t>
+              <w:t>0x707</w:t>
             </w:r>
           </w:p>
         </w:tc>
@@ -4360,7 +4388,7 @@
                 <w:sz w:val="17"/>
                 <w:szCs w:val="17"/>
               </w:rPr>
-              <w:t xml:space="preserve">0x08</w:t>
+              <w:t>0x708</w:t>
             </w:r>
           </w:p>
         </w:tc>
@@ -4482,7 +4510,7 @@
                 <w:sz w:val="17"/>
                 <w:szCs w:val="17"/>
               </w:rPr>
-              <w:t xml:space="preserve">0x09–0x0C</w:t>
+              <w:t>0x709–0x70C</w:t>
             </w:r>
           </w:p>
         </w:tc>
@@ -4604,7 +4632,7 @@
                 <w:sz w:val="17"/>
                 <w:szCs w:val="17"/>
               </w:rPr>
-              <w:t xml:space="preserve">0x0D</w:t>
+              <w:t>0x70D</w:t>
             </w:r>
           </w:p>
         </w:tc>
@@ -4726,7 +4754,7 @@
                 <w:sz w:val="17"/>
                 <w:szCs w:val="17"/>
               </w:rPr>
-              <w:t xml:space="preserve">0x10–0x7F</w:t>
+              <w:t>0x710–0x77F</w:t>
             </w:r>
           </w:p>
         </w:tc>

</xml_diff>